<commit_message>
feat(cuentas): crear cuenta al vuelo desde cualquier selector de Cuenta
- El selector muestra '➕ Crear nueva cuenta "<texto>"' cuando el texto no coincide con ninguna cuenta existente
- Reutiliza el modal de creación rápida existente (openQuickCuentaModal): no redirige, conserva los datos del formulario original y selecciona la cuenta nueva al guardar
- Habilitado en Leads, Visitas, Contactos y las fichas editables (misma lógica compartida)
- Contactos: se agrega la opción al buscador propio reutilizando el mismo modal
- Guías de Contactos/Leads/Visitas actualizadas a v1.1
</commit_message>
<xml_diff>
--- a/docs/manuales/Guia_Contactos.docx
+++ b/docs/manuales/Guia_Contactos.docx
@@ -80,7 +80,7 @@
           <w:color w:val="56648F"/>
           <w:sz w:val="21"/>
         </w:rPr>
-        <w:t>Versión 1.0   ·   23/07/2026</w:t>
+        <w:t>Versión 1.1   ·   23/07/2026</w:t>
       </w:r>
     </w:p>
     <w:p/>
@@ -132,7 +132,7 @@
     </w:p>
     <w:p>
       <w:r>
-        <w:t>Buscar y seleccionar la empresa a la que pertenece el contacto.</w:t>
+        <w:t>Buscar y seleccionar la empresa a la que pertenece el contacto. Si la empresa no existe todavía, al final de la lista aparece la opción "➕ Crear nueva cuenta": se crea en el momento, sin salir del formulario, y queda seleccionada.</w:t>
       </w:r>
     </w:p>
     <w:p>

</xml_diff>

<commit_message>
feat: Puesto condicional en Leads, orden Dashboard y tarjeta 'Perfil Comercial' en Contactos
Leads:
- El campo Puesto solo aparece cuando Cargo = Otro (creación y edición inline), igual que en Contactos

Dashboard (Home):
- Nuevo orden de tarjetas: Oficinas, Industrial, Retail, Cuentas, Contactos, Leads, Nueva Visita, PPTs

Contactos:
- Nueva tarjeta 'Perfil Comercial' (ficha y edición inline) debajo de la info personal
- '¿Es inversor?' Sí/No sin valor por defecto (obligatorio elegir); Unidad de negocio de interés solo si Sí
- Reutiliza chips cto-pref-chip, edición inline delegada en saveContactoDrawer
- Guías Contactos v2.2 y Leads v2.6
</commit_message>
<xml_diff>
--- a/docs/manuales/Guia_Contactos.docx
+++ b/docs/manuales/Guia_Contactos.docx
@@ -80,7 +80,7 @@
           <w:color w:val="56648F"/>
           <w:sz w:val="21"/>
         </w:rPr>
-        <w:t>Versión 2.1   ·   23/07/2026</w:t>
+        <w:t>Versión 2.2   ·   23/07/2026</w:t>
       </w:r>
     </w:p>
     <w:p/>
@@ -315,7 +315,7 @@
           <w:color w:val="00285A"/>
           <w:sz w:val="23"/>
         </w:rPr>
-        <w:t>Inversor</w:t>
+        <w:t>¿Es inversor?</w:t>
       </w:r>
     </w:p>
     <w:p>
@@ -330,7 +330,7 @@
     </w:p>
     <w:p>
       <w:r>
-        <w:t>Indicar si la persona es inversor (Sí/No). Aparece debajo de Puesto.</w:t>
+        <w:t>En la tarjeta 'Perfil Comercial': indicar Sí o No. Es obligatorio elegir una opción (no viene seleccionada por defecto).</w:t>
       </w:r>
     </w:p>
     <w:p>
@@ -363,7 +363,7 @@
     </w:p>
     <w:p>
       <w:r>
-        <w:t>Solo si Inversor = Sí: seleccionar las unidades que le interesan (Oficinas, Retail, Industria &amp; Logística).</w:t>
+        <w:t>Aparece solo si '¿Es inversor?' = Sí: seleccionar las unidades que le interesan (Oficinas, Retail, Industria &amp; Logística).</w:t>
       </w:r>
     </w:p>
     <w:p>

</xml_diff>